<commit_message>
Order form delivery model: always Co-build, never Novagentica-built
Encode the rule in the canonical PS generator (build_of_ps.js): Co-build
(Agentic Atelier) is pre-selected and a note states Novagentica does not
deliver on a pure Novagentica-built basis. Regenerate the Hensoldt PS
order form so Co-build is ticked. Commit the deal patcher for reproducibility.

Co-Authored-By: Claude Opus 4.8 <noreply@anthropic.com>
Claude-Session: https://claude.ai/code/session_01W8kBBW4BVuRrNp2xJG4Ntk
</commit_message>
<xml_diff>
--- a/outputs/Novagentica_OF_Professional_Services_Hensoldt.docx
+++ b/outputs/Novagentica_OF_Professional_Services_Hensoldt.docx
@@ -1133,7 +1133,7 @@
                 <w:szCs w:val="18"/>
                 <w:rFonts w:ascii="Inter" w:cs="Inter" w:eastAsia="Inter" w:hAnsi="Inter"/>
               </w:rPr>
-              <w:t xml:space="preserve">☒</w:t>
+              <w:t xml:space="preserve">☐</w:t>
             </w:r>
           </w:p>
         </w:tc>
@@ -1235,7 +1235,7 @@
                 <w:szCs w:val="18"/>
                 <w:rFonts w:ascii="Inter" w:cs="Inter" w:eastAsia="Inter" w:hAnsi="Inter"/>
               </w:rPr>
-              <w:t xml:space="preserve">☐</w:t>
+              <w:t xml:space="preserve">☒</w:t>
             </w:r>
           </w:p>
         </w:tc>
@@ -1409,6 +1409,39 @@
         </w:tc>
       </w:tr>
     </w:tbl>
+    <w:p>
+      <w:pPr>
+        <w:pBdr>
+          <w:left w:val="single" w:color="8A6D00" w:sz="18" w:space="10"/>
+        </w:pBdr>
+        <w:spacing w:after="130" w:line="258"/>
+        <w:ind w:left="120"/>
+      </w:pPr>
+      <w:r>
+        <w:rPr>
+          <w:b/>
+          <w:bCs/>
+          <w:i/>
+          <w:iCs/>
+          <w:color w:val="8A6D00"/>
+          <w:sz w:val="16"/>
+          <w:szCs w:val="16"/>
+          <w:rFonts w:ascii="Inter" w:cs="Inter" w:eastAsia="Inter" w:hAnsi="Inter"/>
+        </w:rPr>
+        <w:t xml:space="preserve">‹ drafting note › </w:t>
+      </w:r>
+      <w:r>
+        <w:rPr>
+          <w:i/>
+          <w:iCs/>
+          <w:color w:val="8A6D00"/>
+          <w:sz w:val="16"/>
+          <w:szCs w:val="16"/>
+          <w:rFonts w:ascii="Inter" w:cs="Inter" w:eastAsia="Inter" w:hAnsi="Inter"/>
+        </w:rPr>
+        <w:t xml:space="preserve">Delivery model is always Co-build (Agentic Atelier) — Novagentica does not deliver on a pure “Novagentica-built” basis. Keep Co-build selected; the other rows are shown for context.</w:t>
+      </w:r>
+    </w:p>
     <w:p>
       <w:pPr>
         <w:keepNext/>

</xml_diff>

<commit_message>
Hensoldt PS: co-build framing for MVP2/MVP3; move skill change off this branch
- MVP2 and MVP3 descriptions reframed as co-build (Agentic Atelier) work
  alongside Hensoldt's HR/engineering and SAP/procurement teams, with
  knowledge transfer; delivery model ticked Co-build in the deal patcher.
- Revert the canonical build_of_ps.js change on this feature branch; the
  Co-build delivery-model default belongs centrally on main, not under the
  Hensoldt branch (landed separately).

Co-Authored-By: Claude Opus 4.8 <noreply@anthropic.com>
Claude-Session: https://claude.ai/code/session_01W8kBBW4BVuRrNp2xJG4Ntk
</commit_message>
<xml_diff>
--- a/outputs/Novagentica_OF_Professional_Services_Hensoldt.docx
+++ b/outputs/Novagentica_OF_Professional_Services_Hensoldt.docx
@@ -1411,39 +1411,6 @@
     </w:tbl>
     <w:p>
       <w:pPr>
-        <w:pBdr>
-          <w:left w:val="single" w:color="8A6D00" w:sz="18" w:space="10"/>
-        </w:pBdr>
-        <w:spacing w:after="130" w:line="258"/>
-        <w:ind w:left="120"/>
-      </w:pPr>
-      <w:r>
-        <w:rPr>
-          <w:b/>
-          <w:bCs/>
-          <w:i/>
-          <w:iCs/>
-          <w:color w:val="8A6D00"/>
-          <w:sz w:val="16"/>
-          <w:szCs w:val="16"/>
-          <w:rFonts w:ascii="Inter" w:cs="Inter" w:eastAsia="Inter" w:hAnsi="Inter"/>
-        </w:rPr>
-        <w:t xml:space="preserve">‹ drafting note › </w:t>
-      </w:r>
-      <w:r>
-        <w:rPr>
-          <w:i/>
-          <w:iCs/>
-          <w:color w:val="8A6D00"/>
-          <w:sz w:val="16"/>
-          <w:szCs w:val="16"/>
-          <w:rFonts w:ascii="Inter" w:cs="Inter" w:eastAsia="Inter" w:hAnsi="Inter"/>
-        </w:rPr>
-        <w:t xml:space="preserve">Delivery model is always Co-build (Agentic Atelier) — Novagentica does not deliver on a pure “Novagentica-built” basis. Keep Co-build selected; the other rows are shown for context.</w:t>
-      </w:r>
-    </w:p>
-    <w:p>
-      <w:pPr>
         <w:keepNext/>
         <w:pBdr>
           <w:bottom w:val="single" w:color="CC0D2C" w:sz="8" w:space="4"/>
@@ -2342,7 +2309,7 @@
                 <w:szCs w:val="18"/>
                 <w:rFonts w:ascii="Inter" w:cs="Inter" w:eastAsia="Inter" w:hAnsi="Inter"/>
               </w:rPr>
-              <w:t xml:space="preserve">Candidate screening on SuccessFactors — rank-and-recommend with Article 14 human sign-off (Annex III high-risk; works-council gated).</w:t>
+              <w:t xml:space="preserve">Candidate screening on SuccessFactors — co-built with Hensoldt’s HR and engineering teams in the Agentic Atelier, who are upskilled to own it; rank-and-recommend with Article 14 human sign-off (Annex III high-risk; works-council gated).</w:t>
             </w:r>
           </w:p>
         </w:tc>
@@ -2444,7 +2411,7 @@
                 <w:szCs w:val="18"/>
                 <w:rFonts w:ascii="Inter" w:cs="Inter" w:eastAsia="Inter" w:hAnsi="Inter"/>
               </w:rPr>
-              <w:t xml:space="preserve">SAP source-to-PO on SAP MM — in-policy purchase orders drawn automatically; out-of-policy escalated; every output signed.</w:t>
+              <w:t xml:space="preserve">SAP source-to-PO on SAP MM — co-built alongside Hensoldt’s SAP and procurement teams in the Agentic Atelier, with knowledge transfer so the team can own and extend it; in-policy purchase orders drawn automatically, out-of-policy escalated, every output signed.</w:t>
             </w:r>
           </w:p>
         </w:tc>

</xml_diff>